<commit_message>
docs: update academic materials for completed IWFC features
</commit_message>
<xml_diff>
--- a/submission/prac1/IWFC_PRAC1_Report.docx
+++ b/submission/prac1/IWFC_PRAC1_Report.docx
@@ -306,7 +306,7 @@
                 <w:color w:val="17202A"/>
                 <w:sz w:val="24"/>
               </w:rPr>
-              <w:t>2,934 words before references and appendix</w:t>
+              <w:t>3,124 words before references and appendix</w:t>
             </w:r>
           </w:p>
         </w:tc>
@@ -611,7 +611,7 @@
           <w:color w:val="17202A"/>
           <w:sz w:val="24"/>
         </w:rPr>
-        <w:t xml:space="preserve">The prototype supports Administrator-controlled accounts and equipment, Instructor-controlled scheduling and fault reporting, Member session discovery and booking, cumulative equipment usage, and a guarded maintenance lifecycle. Scheduling rejects operating-hours violations and overlapping Instructor, studio or equipment allocations. Maintenance follows </w:t>
+        <w:t xml:space="preserve">The prototype supports Administrator-controlled accounts and equipment, Instructor-controlled scheduling and fault reporting, Member session discovery and booking, cumulative equipment usage, and a guarded maintenance lifecycle. Scheduling rejects operating-hours violations and overlapping Instructor, studio or equipment allocations. Instructors can create weekly series of one to twelve sessions through an atomic validation process. Successful bookings produce a confirmation and deterministic wellness tip, while faults generate notices for active Members booked into affected sessions. Maintenance follows </w:t>
       </w:r>
       <w:r>
         <w:rPr>
@@ -631,7 +631,7 @@
           <w:color w:val="17202A"/>
           <w:sz w:val="24"/>
         </w:rPr>
-        <w:t>, while preventative alerts occur at an inclusive 100-hour threshold and reset safely after completed maintenance.</w:t>
+        <w:t>, and preventative alerts occur at an inclusive 100-hour threshold before resetting safely after completed maintenance.</w:t>
       </w:r>
     </w:p>
     <w:p>
@@ -643,7 +643,7 @@
           <w:color w:val="17202A"/>
           <w:sz w:val="24"/>
         </w:rPr>
-        <w:t>Verification used JUnit Jupiter and Maven. The final suite comprises 126 passing tests in 14 test classes, with no failures, errors or skipped tests. Tests cover successful use cases, authorization, duplicate data, invalid transitions, boundary values and a complete Facade-only integration workflow. The project is version-controlled in a private GitHub repository. The main limitations are in-memory persistence, simplified identity handling, no concurrency control, no optional recurring-session feature, and no Member schedule-reminder publisher.</w:t>
+        <w:t>Verification used JUnit Jupiter and Maven. The final suite comprises 142 passing tests in 14 test classes, with no failures, errors or skipped tests. Tests cover successful use cases, authorization, duplicate data, invalid transitions, recurring-series atomicity, notification filtering, sample data, console views, boundary values and a complete Facade-only integration workflow. The project is version-controlled in a private GitHub repository. The main limitations are in-memory persistence, simplified identity handling and no concurrency control.</w:t>
       </w:r>
     </w:p>
     <w:p>
@@ -809,10 +809,18 @@
           <w:color w:val="17202A"/>
           <w:sz w:val="24"/>
         </w:rPr>
-        <w:t>. An overlap is rejected when the sessions share an Instructor, studio or equipment unit, while adjacent sessions are allowed. Members can view bookable sessions and their own bookings. An active registered Member may book once, provided capacity remains and all required equipment is still available.</w:t>
-      </w:r>
-    </w:p>
-    <w:p>
+        <w:t xml:space="preserve">. An overlap is rejected when the sessions share an Instructor, studio or equipment unit, while adjacent sessions are allowed. </w:t>
+      </w:r>
+      <w:r>
+        <w:rPr>
+          <w:rFonts w:ascii="Consolas" w:hAnsi="Consolas"/>
+          <w:b w:val="0"/>
+          <w:i w:val="0"/>
+          <w:color w:val="193A5A"/>
+          <w:sz w:val="21"/>
+        </w:rPr>
+        <w:t>scheduleWeeklySessions</w:t>
+      </w:r>
       <w:r>
         <w:rPr>
           <w:rFonts w:ascii="Arial" w:hAnsi="Arial"/>
@@ -821,6 +829,18 @@
           <w:color w:val="17202A"/>
           <w:sz w:val="24"/>
         </w:rPr>
+        <w:t xml:space="preserve"> applies the same rules to every occurrence and saves none if any week fails. Members can view bookable sessions and their own bookings. An active registered Member may book once, provided capacity remains and all required equipment is still available. A successful booking sends a confirmation and one deterministic wellness tip.</w:t>
+      </w:r>
+    </w:p>
+    <w:p>
+      <w:r>
+        <w:rPr>
+          <w:rFonts w:ascii="Arial" w:hAnsi="Arial"/>
+          <w:b w:val="0"/>
+          <w:i w:val="0"/>
+          <w:color w:val="17202A"/>
+          <w:sz w:val="24"/>
+        </w:rPr>
         <w:t xml:space="preserve">Third, an active Instructor reports a fault with a unique request ID, equipment ID, description and urgency. The request begins </w:t>
       </w:r>
       <w:r>
@@ -841,10 +861,18 @@
           <w:color w:val="17202A"/>
           <w:sz w:val="24"/>
         </w:rPr>
-        <w:t>; only an Administrator can assign and complete it. Notifications are event-specific: active Administrators receive new-fault and preventative-maintenance alerts, while the active reporting Instructor receives assignment and completion updates. Usage may only be recorded by the Instructor who owns the active session and only against equipment allocated to that session.</w:t>
-      </w:r>
-    </w:p>
-    <w:p>
+        <w:t xml:space="preserve">; only an Administrator can assign and complete it. Notifications are event-specific: active Administrators receive new-fault and preventative-maintenance alerts, the active reporting Instructor receives assignment and completion updates, and active Members booked into an affected active session receive a schedule notice. Completing one request recalculates equipment state from other open requests: any remaining </w:t>
+      </w:r>
+      <w:r>
+        <w:rPr>
+          <w:rFonts w:ascii="Consolas" w:hAnsi="Consolas"/>
+          <w:b w:val="0"/>
+          <w:i w:val="0"/>
+          <w:color w:val="193A5A"/>
+          <w:sz w:val="21"/>
+        </w:rPr>
+        <w:t>PENDING</w:t>
+      </w:r>
       <w:r>
         <w:rPr>
           <w:rFonts w:ascii="Arial" w:hAnsi="Arial"/>
@@ -853,7 +881,99 @@
           <w:color w:val="17202A"/>
           <w:sz w:val="24"/>
         </w:rPr>
-        <w:t>Non-functional priorities were correctness, traceability and presentation clarity. The application must fail safely, keep its internal collections protected, compile strictly under Java 21 and provide reproducible automated evidence. Recurring weekly sessions were excluded because the brief labels them optional. Database, password authentication and graphical presentation were also outside the prototype scope.</w:t>
+        <w:t xml:space="preserve"> request keeps it </w:t>
+      </w:r>
+      <w:r>
+        <w:rPr>
+          <w:rFonts w:ascii="Consolas" w:hAnsi="Consolas"/>
+          <w:b w:val="0"/>
+          <w:i w:val="0"/>
+          <w:color w:val="193A5A"/>
+          <w:sz w:val="21"/>
+        </w:rPr>
+        <w:t>FAULTY</w:t>
+      </w:r>
+      <w:r>
+        <w:rPr>
+          <w:rFonts w:ascii="Arial" w:hAnsi="Arial"/>
+          <w:b w:val="0"/>
+          <w:i w:val="0"/>
+          <w:color w:val="17202A"/>
+          <w:sz w:val="24"/>
+        </w:rPr>
+        <w:t xml:space="preserve">, remaining </w:t>
+      </w:r>
+      <w:r>
+        <w:rPr>
+          <w:rFonts w:ascii="Consolas" w:hAnsi="Consolas"/>
+          <w:b w:val="0"/>
+          <w:i w:val="0"/>
+          <w:color w:val="193A5A"/>
+          <w:sz w:val="21"/>
+        </w:rPr>
+        <w:t>ASSIGNED</w:t>
+      </w:r>
+      <w:r>
+        <w:rPr>
+          <w:rFonts w:ascii="Arial" w:hAnsi="Arial"/>
+          <w:b w:val="0"/>
+          <w:i w:val="0"/>
+          <w:color w:val="17202A"/>
+          <w:sz w:val="24"/>
+        </w:rPr>
+        <w:t xml:space="preserve"> requests keep it </w:t>
+      </w:r>
+      <w:r>
+        <w:rPr>
+          <w:rFonts w:ascii="Consolas" w:hAnsi="Consolas"/>
+          <w:b w:val="0"/>
+          <w:i w:val="0"/>
+          <w:color w:val="193A5A"/>
+          <w:sz w:val="21"/>
+        </w:rPr>
+        <w:t>UNDER_MAINTENANCE</w:t>
+      </w:r>
+      <w:r>
+        <w:rPr>
+          <w:rFonts w:ascii="Arial" w:hAnsi="Arial"/>
+          <w:b w:val="0"/>
+          <w:i w:val="0"/>
+          <w:color w:val="17202A"/>
+          <w:sz w:val="24"/>
+        </w:rPr>
+        <w:t xml:space="preserve">, and only no open request permits </w:t>
+      </w:r>
+      <w:r>
+        <w:rPr>
+          <w:rFonts w:ascii="Consolas" w:hAnsi="Consolas"/>
+          <w:b w:val="0"/>
+          <w:i w:val="0"/>
+          <w:color w:val="193A5A"/>
+          <w:sz w:val="21"/>
+        </w:rPr>
+        <w:t>OPERATIONAL</w:t>
+      </w:r>
+      <w:r>
+        <w:rPr>
+          <w:rFonts w:ascii="Arial" w:hAnsi="Arial"/>
+          <w:b w:val="0"/>
+          <w:i w:val="0"/>
+          <w:color w:val="17202A"/>
+          <w:sz w:val="24"/>
+        </w:rPr>
+        <w:t>. Usage may only be recorded by the Instructor who owns the active session and only against equipment allocated to that session.</w:t>
+      </w:r>
+    </w:p>
+    <w:p>
+      <w:r>
+        <w:rPr>
+          <w:rFonts w:ascii="Arial" w:hAnsi="Arial"/>
+          <w:b w:val="0"/>
+          <w:i w:val="0"/>
+          <w:color w:val="17202A"/>
+          <w:sz w:val="24"/>
+        </w:rPr>
+        <w:t>Non-functional priorities were correctness, traceability and presentation clarity. The application must fail safely, keep its internal collections protected, compile strictly under Java 21 and provide reproducible automated evidence. The optional recurring-session enhancement was implemented within the existing class structure. Database, password authentication and graphical presentation remain outside the prototype scope.</w:t>
       </w:r>
     </w:p>
     <w:p>
@@ -1646,7 +1766,67 @@
           <w:color w:val="193A5A"/>
           <w:sz w:val="21"/>
         </w:rPr>
+        <w:t>scheduleWeeklySessions</w:t>
+      </w:r>
+      <w:r>
+        <w:rPr>
+          <w:rFonts w:ascii="Arial" w:hAnsi="Arial"/>
+          <w:b w:val="0"/>
+          <w:i w:val="0"/>
+          <w:color w:val="17202A"/>
+          <w:sz w:val="24"/>
+        </w:rPr>
+        <w:t xml:space="preserve">, </w:t>
+      </w:r>
+      <w:r>
+        <w:rPr>
+          <w:rFonts w:ascii="Consolas" w:hAnsi="Consolas"/>
+          <w:b w:val="0"/>
+          <w:i w:val="0"/>
+          <w:color w:val="193A5A"/>
+          <w:sz w:val="21"/>
+        </w:rPr>
         <w:t>bookSession</w:t>
+      </w:r>
+      <w:r>
+        <w:rPr>
+          <w:rFonts w:ascii="Arial" w:hAnsi="Arial"/>
+          <w:b w:val="0"/>
+          <w:i w:val="0"/>
+          <w:color w:val="17202A"/>
+          <w:sz w:val="24"/>
+        </w:rPr>
+        <w:t xml:space="preserve">, </w:t>
+      </w:r>
+      <w:r>
+        <w:rPr>
+          <w:rFonts w:ascii="Consolas" w:hAnsi="Consolas"/>
+          <w:b w:val="0"/>
+          <w:i w:val="0"/>
+          <w:color w:val="193A5A"/>
+          <w:sz w:val="21"/>
+        </w:rPr>
+        <w:t>viewAllSessions</w:t>
+      </w:r>
+      <w:r>
+        <w:rPr>
+          <w:rFonts w:ascii="Arial" w:hAnsi="Arial"/>
+          <w:b w:val="0"/>
+          <w:i w:val="0"/>
+          <w:color w:val="17202A"/>
+          <w:sz w:val="24"/>
+        </w:rPr>
+        <w:t xml:space="preserve">, </w:t>
+      </w:r>
+      <w:r>
+        <w:rPr>
+          <w:rFonts w:ascii="Consolas" w:hAnsi="Consolas"/>
+          <w:b w:val="0"/>
+          <w:i w:val="0"/>
+          <w:color w:val="193A5A"/>
+          <w:sz w:val="21"/>
+        </w:rPr>
+        <w:t>loadSampleData</w:t>
       </w:r>
       <w:r>
         <w:rPr>
@@ -1818,7 +1998,47 @@
           <w:color w:val="17202A"/>
           <w:sz w:val="24"/>
         </w:rPr>
-        <w:t xml:space="preserve"> objects are observers. Registration occurs when the Facade creates an account. Publishing filters observers by active state, role and event relevance. New faults and preventative thresholds go to active Administrators; assignment and completion messages go only to the active reporting Instructor. Duplicate registration does not duplicate delivery, and unrelated Members or Instructors receive nothing.</w:t>
+        <w:t xml:space="preserve"> objects are observers. Registration occurs when the Facade creates an account. Publishing filters observers by active state, role and event relevance. New faults and preventative thresholds go to active Administrators; assignment and completion messages go only to the active reporting Instructor; equipment-fault notices go only to active Members booked into affected active sessions. </w:t>
+      </w:r>
+      <w:r>
+        <w:rPr>
+          <w:rFonts w:ascii="Consolas" w:hAnsi="Consolas"/>
+          <w:b w:val="0"/>
+          <w:i w:val="0"/>
+          <w:color w:val="193A5A"/>
+          <w:sz w:val="21"/>
+        </w:rPr>
+        <w:t>BookingService</w:t>
+      </w:r>
+      <w:r>
+        <w:rPr>
+          <w:rFonts w:ascii="Arial" w:hAnsi="Arial"/>
+          <w:b w:val="0"/>
+          <w:i w:val="0"/>
+          <w:color w:val="17202A"/>
+          <w:sz w:val="24"/>
+        </w:rPr>
+        <w:t xml:space="preserve"> uses the same </w:t>
+      </w:r>
+      <w:r>
+        <w:rPr>
+          <w:rFonts w:ascii="Consolas" w:hAnsi="Consolas"/>
+          <w:b w:val="0"/>
+          <w:i w:val="0"/>
+          <w:color w:val="193A5A"/>
+          <w:sz w:val="21"/>
+        </w:rPr>
+        <w:t>User.receiveNotification</w:t>
+      </w:r>
+      <w:r>
+        <w:rPr>
+          <w:rFonts w:ascii="Arial" w:hAnsi="Arial"/>
+          <w:b w:val="0"/>
+          <w:i w:val="0"/>
+          <w:color w:val="17202A"/>
+          <w:sz w:val="24"/>
+        </w:rPr>
+        <w:t xml:space="preserve"> channel for booking confirmations and deterministic wellness tips. Duplicate observer registration does not duplicate delivery, and unrelated or inactive users receive nothing.</w:t>
       </w:r>
     </w:p>
     <w:p>
@@ -2595,7 +2815,7 @@
           <w:color w:val="17202A"/>
           <w:sz w:val="24"/>
         </w:rPr>
-        <w:t xml:space="preserve"> adds contextual rules that require repository knowledge: opening hours, registered Instructor status, resource existence and conflicts with other sessions. </w:t>
+        <w:t xml:space="preserve"> adds contextual rules that require repository knowledge: opening hours, registered Instructor status, resource existence and conflicts with other sessions. Weekly scheduling reuses the same validation path, constructs IDs from </w:t>
       </w:r>
       <w:r>
         <w:rPr>
@@ -2605,7 +2825,7 @@
           <w:color w:val="193A5A"/>
           <w:sz w:val="21"/>
         </w:rPr>
-        <w:t>IWFCFacade</w:t>
+        <w:t>&lt;baseId&gt;-W1</w:t>
       </w:r>
       <w:r>
         <w:rPr>
@@ -2615,10 +2835,18 @@
           <w:color w:val="17202A"/>
           <w:sz w:val="24"/>
         </w:rPr>
-        <w:t xml:space="preserve"> adds application authorization and derives the Instructor ID from the authenticated actor, preventing a caller from scheduling under another Instructor's identity. The rule is therefore enforced at the layer with the necessary information rather than duplicated everywhere.</w:t>
-      </w:r>
-    </w:p>
-    <w:p>
+        <w:t xml:space="preserve"> onward and validates the whole one-to-twelve-week series before saving any occurrence. </w:t>
+      </w:r>
+      <w:r>
+        <w:rPr>
+          <w:rFonts w:ascii="Consolas" w:hAnsi="Consolas"/>
+          <w:b w:val="0"/>
+          <w:i w:val="0"/>
+          <w:color w:val="193A5A"/>
+          <w:sz w:val="21"/>
+        </w:rPr>
+        <w:t>IWFCFacade</w:t>
+      </w:r>
       <w:r>
         <w:rPr>
           <w:rFonts w:ascii="Arial" w:hAnsi="Arial"/>
@@ -2627,7 +2855,7 @@
           <w:color w:val="17202A"/>
           <w:sz w:val="24"/>
         </w:rPr>
-        <w:t>Member booking rechecks session activity, capacity and current equipment state. This decision means that a session scheduled while equipment was operational is not still advertised as available after a later fault. The booking set provides idempotent membership identity, but the service raises a meaningful exception rather than silently accepting a repeated request. Query methods use filtered, read-only results so presentation code can display availability without gaining mutation access.</w:t>
+        <w:t xml:space="preserve"> adds application authorization and derives the Instructor ID from the authenticated actor, preventing a caller from scheduling under another Instructor's identity. The rule is therefore enforced at the layer with the necessary information rather than duplicated everywhere.</w:t>
       </w:r>
     </w:p>
     <w:p>
@@ -2639,7 +2867,39 @@
           <w:color w:val="17202A"/>
           <w:sz w:val="24"/>
         </w:rPr>
-        <w:t>The guided console demonstrates these interactions with fixed demonstration identifiers and tomorrow's local date. It is not the business-logic owner: every step calls a public Facade method. A second attempt reports duplicate data and returns to the menu, showing safe error handling. Keeping the console narrow supports the brief's emphasis on architecture over visual appearance and ensures that automated integration tests exercise the same application boundary used by the live demonstration.</w:t>
+        <w:t xml:space="preserve">Member booking rechecks session activity, capacity and current equipment state. This decision means that a session scheduled while equipment was operational is not still advertised as available after a later fault. The booking set provides idempotent membership identity, but the service raises a meaningful exception rather than silently accepting a repeated request. Only a successful booking publishes its confirmation and wellness tip. Query methods use filtered, read-only results so presentation code can display availability without gaining mutation access, while the Administrator-only </w:t>
+      </w:r>
+      <w:r>
+        <w:rPr>
+          <w:rFonts w:ascii="Consolas" w:hAnsi="Consolas"/>
+          <w:b w:val="0"/>
+          <w:i w:val="0"/>
+          <w:color w:val="193A5A"/>
+          <w:sz w:val="21"/>
+        </w:rPr>
+        <w:t>viewAllSessions</w:t>
+      </w:r>
+      <w:r>
+        <w:rPr>
+          <w:rFonts w:ascii="Arial" w:hAnsi="Arial"/>
+          <w:b w:val="0"/>
+          <w:i w:val="0"/>
+          <w:color w:val="17202A"/>
+          <w:sz w:val="24"/>
+        </w:rPr>
+        <w:t xml:space="preserve"> includes full and recurring sessions.</w:t>
+      </w:r>
+    </w:p>
+    <w:p>
+      <w:r>
+        <w:rPr>
+          <w:rFonts w:ascii="Arial" w:hAnsi="Arial"/>
+          <w:b w:val="0"/>
+          <w:i w:val="0"/>
+          <w:color w:val="17202A"/>
+          <w:sz w:val="24"/>
+        </w:rPr>
+        <w:t>The console demonstrates these interactions without becoming the business-logic owner: every workflow step calls a public Facade method. Option 1 runs the guided end-to-end workflow and visibly prints Member and Administrator notifications. Option 2 loads a prechecked sample dataset through normal Facade operations. Option 3 uses Administrator views to print equipment, every session including full and recurring sessions, and maintenance requests. A second sample load is rejected before any record is created. Keeping the console narrow supports the brief's emphasis on architecture over visual appearance and ensures that automated tests exercise the same application boundary used by the live demonstration.</w:t>
       </w:r>
     </w:p>
     <w:p>
@@ -2857,7 +3117,7 @@
           <w:color w:val="17202A"/>
           <w:sz w:val="24"/>
         </w:rPr>
-        <w:t xml:space="preserve">The final Maven execution compiled 15 production and 14 test source files. Surefire reported 126 tests, 0 failures, 0 errors and 0 skipped tests. Strict compilation also succeeded with </w:t>
+        <w:t xml:space="preserve">The final Maven execution compiled 15 production and 14 test source files. Surefire reported 142 tests, 0 failures, 0 errors and 0 skipped tests. Strict compilation also succeeded with </w:t>
       </w:r>
       <w:r>
         <w:rPr>
@@ -2932,7 +3192,7 @@
           <w:color w:val="17202A"/>
           <w:sz w:val="24"/>
         </w:rPr>
-        <w:t>Figure 3. Distribution of the 126 passing tests by test area.</w:t>
+        <w:t>Figure 3. Distribution of the 142 passing tests by test area.</w:t>
       </w:r>
     </w:p>
     <w:p>
@@ -2944,7 +3204,7 @@
           <w:color w:val="17202A"/>
           <w:sz w:val="24"/>
         </w:rPr>
-        <w:t>Testing was layered. Domain tests verify constructor validation, encapsulation, overlap mathematics, capacity, state transitions and usage thresholds. Repository and Factory tests verify generic reuse, uniqueness and creation of all roles. Service tests verify scheduling, booking, equipment eligibility, maintenance, Observer routing and alert cycles. Facade tests prove role, registration, identity and active-account guards. Console tests use scripted input to verify blank-value recovery, invalid menu handling, a successful guided demonstration, repeated-demo error recovery and safe end-of-input.</w:t>
+        <w:t>Testing was layered. Domain tests verify constructor validation, encapsulation, overlap mathematics, capacity, state transitions and usage thresholds. Repository and Factory tests verify generic reuse, uniqueness and creation of all roles. Service tests verify ordinary and recurring scheduling, atomic series rejection, booking notifications, equipment eligibility, multiple open maintenance requests, Observer routing and alert cycles. Facade tests prove role, registration, identity and active-account guards, sample-data state and Administrator session listing. Console tests use scripted input to verify input recovery, the guided demonstration, sample loading, complete data views, second-load rejection and safe end-of-input.</w:t>
       </w:r>
     </w:p>
     <w:p>
@@ -3053,7 +3313,7 @@
           <w:color w:val="17202A"/>
           <w:sz w:val="24"/>
         </w:rPr>
-        <w:t>Limitations remain. All data and alert latches are in memory, so restarting loses state. Actor validation uses object identity rather than credentials. Concurrent bookings are not transaction-safe. Maintenance assignees are text instead of technician accounts. Local date-times have no timezone policy. Recurring weekly sessions, although encouraged, are not implemented. The shared notification receiver exists for every user, but Member wellness and schedule-reminder events are not published; current notifications are maintenance-focused.</w:t>
+        <w:t>Limitations remain. All data and alert latches are in memory, so restarting loses state. Actor validation uses object identity rather than credentials. Concurrent bookings are not transaction-safe. Maintenance assignees are text instead of technician accounts. Local date-times have no timezone policy. Weekly recurrence uses a fixed interval and occurrence count rather than a general calendar recurrence model. Notifications remain in-memory messages with no email, mobile delivery, persistence or read-state tracking.</w:t>
       </w:r>
     </w:p>
     <w:p>
@@ -3065,7 +3325,7 @@
           <w:color w:val="17202A"/>
           <w:sz w:val="24"/>
         </w:rPr>
-        <w:t>Future development should introduce persistent repositories behind the existing service boundaries, secure login and role claims, transaction-safe booking, technician entities, configurable opening hours and thresholds, recurrence generation, Member reminders, durable audit logs and a web or graphical interface. These changes should retain the Facade API and domain invariants while replacing infrastructure incrementally. Concurrency and authentication would require additional integration and security testing rather than assumptions based on the single-process prototype.</w:t>
+        <w:t>Future development should introduce persistent repositories behind the existing service boundaries, secure login and role claims, transaction-safe booking, technician entities, configurable opening hours and thresholds, richer recurrence rules, durable notification delivery, audit logs and a web or graphical interface. These changes should retain the Facade API and domain invariants while replacing infrastructure incrementally. Concurrency and authentication would require additional integration and security testing rather than assumptions based on the single-process prototype.</w:t>
       </w:r>
     </w:p>
     <w:p>
@@ -3086,7 +3346,7 @@
           <w:color w:val="17202A"/>
           <w:sz w:val="24"/>
         </w:rPr>
-        <w:t>IWFC demonstrates a complete Java 21 prototype for equipment management, validated scheduling, Member booking, maintenance processing, usage alerts and targeted notifications. Its 15-class architecture applies encapsulation, abstraction, inheritance, polymorphism, collections, generics and three required pattern categories in connected workflows. Custom exceptions make failure semantics explicit, while 126 passing tests provide reproducible evidence across entities, services, Facade security, console behavior and end-to-end collaboration.</w:t>
+        <w:t>IWFC demonstrates a complete Java 21 prototype for equipment management, ordinary and recurring scheduling, Member booking, maintenance processing, usage alerts and targeted notifications. Its 15-class architecture applies encapsulation, abstraction, inheritance, polymorphism, collections, generics and three required pattern categories in connected workflows. Custom exceptions make failure semantics explicit, while 142 passing tests provide reproducible evidence across entities, services, Facade security, console behavior and end-to-end collaboration.</w:t>
       </w:r>
     </w:p>
     <w:p>
@@ -3512,7 +3772,7 @@
           <w:color w:val="17202A"/>
           <w:sz w:val="24"/>
         </w:rPr>
-        <w:t>Verified result: 126 tests, 0 failures, 0 errors and 0 skipped; 15 production Java source files.</w:t>
+        <w:t>Verified result: 142 tests, 0 failures, 0 errors and 0 skipped; 15 production Java source files.</w:t>
       </w:r>
     </w:p>
     <w:sectPr>

</xml_diff>